<commit_message>
Updated docs and reorganized it 21st July 2k26
</commit_message>
<xml_diff>
--- a/python/p5_part_two_of_oop_of_python.docx
+++ b/python/p5_part_two_of_oop_of_python.docx
@@ -10841,17 +10841,19 @@
           <w:sz w:val="28"/>
           <w:szCs w:val="28"/>
         </w:rPr>
-        <w:t xml:space="preserve"> </w:t>
-      </w:r>
-      <w:r>
+        <w:t xml:space="preserve">     ^</w:t>
+      </w:r>
+    </w:p>
+    <w:p>
+      <w:pPr>
+        <w:jc w:val="both"/>
         <w:rPr>
           <w:b/>
           <w:bCs/>
           <w:sz w:val="28"/>
           <w:szCs w:val="28"/>
         </w:rPr>
-        <w:t xml:space="preserve">    </w:t>
-      </w:r>
+      </w:pPr>
       <w:r>
         <w:rPr>
           <w:b/>
@@ -10859,19 +10861,17 @@
           <w:sz w:val="28"/>
           <w:szCs w:val="28"/>
         </w:rPr>
-        <w:t>^</w:t>
-      </w:r>
-    </w:p>
-    <w:p>
-      <w:pPr>
-        <w:jc w:val="both"/>
+        <w:t xml:space="preserve">     |  </w:t>
+      </w:r>
+      <w:r>
         <w:rPr>
           <w:b/>
           <w:bCs/>
           <w:sz w:val="28"/>
           <w:szCs w:val="28"/>
         </w:rPr>
-      </w:pPr>
+        <w:t xml:space="preserve"> </w:t>
+      </w:r>
       <w:r>
         <w:rPr>
           <w:b/>
@@ -10879,17 +10879,19 @@
           <w:sz w:val="28"/>
           <w:szCs w:val="28"/>
         </w:rPr>
-        <w:t xml:space="preserve">     | </w:t>
-      </w:r>
-      <w:r>
+        <w:t>\</w:t>
+      </w:r>
+    </w:p>
+    <w:p>
+      <w:pPr>
+        <w:jc w:val="both"/>
         <w:rPr>
           <w:b/>
           <w:bCs/>
           <w:sz w:val="28"/>
           <w:szCs w:val="28"/>
         </w:rPr>
-        <w:t xml:space="preserve"> </w:t>
-      </w:r>
+      </w:pPr>
       <w:r>
         <w:rPr>
           <w:b/>
@@ -10897,7 +10899,7 @@
           <w:sz w:val="28"/>
           <w:szCs w:val="28"/>
         </w:rPr>
-        <w:t xml:space="preserve"> </w:t>
+        <w:t xml:space="preserve">     |      </w:t>
       </w:r>
       <w:r>
         <w:rPr>
@@ -10906,28 +10908,28 @@
           <w:sz w:val="28"/>
           <w:szCs w:val="28"/>
         </w:rPr>
-        <w:t>\</w:t>
-      </w:r>
-    </w:p>
-    <w:p>
-      <w:pPr>
-        <w:jc w:val="both"/>
+        <w:t xml:space="preserve"> </w:t>
+      </w:r>
+      <w:r>
         <w:rPr>
           <w:b/>
           <w:bCs/>
           <w:sz w:val="28"/>
           <w:szCs w:val="28"/>
         </w:rPr>
-      </w:pPr>
-      <w:r>
+        <w:t>\</w:t>
+      </w:r>
+    </w:p>
+    <w:p>
+      <w:pPr>
+        <w:jc w:val="both"/>
         <w:rPr>
           <w:b/>
           <w:bCs/>
           <w:sz w:val="28"/>
           <w:szCs w:val="28"/>
         </w:rPr>
-        <w:t xml:space="preserve">     | </w:t>
-      </w:r>
+      </w:pPr>
       <w:r>
         <w:rPr>
           <w:b/>
@@ -10935,7 +10937,7 @@
           <w:sz w:val="28"/>
           <w:szCs w:val="28"/>
         </w:rPr>
-        <w:t xml:space="preserve">    </w:t>
+        <w:t xml:space="preserve">     |       </w:t>
       </w:r>
       <w:r>
         <w:rPr>
@@ -10953,8 +10955,17 @@
           <w:sz w:val="28"/>
           <w:szCs w:val="28"/>
         </w:rPr>
-        <w:t xml:space="preserve"> </w:t>
-      </w:r>
+        <w:t xml:space="preserve">   \</w:t>
+      </w:r>
+    </w:p>
+    <w:p>
+      <w:pPr>
+        <w:jc w:val="both"/>
+        <w:rPr>
+          <w:sz w:val="32"/>
+          <w:szCs w:val="32"/>
+        </w:rPr>
+      </w:pPr>
       <w:r>
         <w:rPr>
           <w:b/>
@@ -10962,96 +10973,13 @@
           <w:sz w:val="28"/>
           <w:szCs w:val="28"/>
         </w:rPr>
-        <w:t>\</w:t>
-      </w:r>
-    </w:p>
-    <w:p>
-      <w:pPr>
-        <w:jc w:val="both"/>
-        <w:rPr>
-          <w:b/>
-          <w:bCs/>
+        <w:t>All variables point here (Entire App)</w:t>
+      </w:r>
+      <w:r>
+        <w:rPr>
           <w:sz w:val="28"/>
           <w:szCs w:val="28"/>
         </w:rPr>
-      </w:pPr>
-      <w:r>
-        <w:rPr>
-          <w:b/>
-          <w:bCs/>
-          <w:sz w:val="28"/>
-          <w:szCs w:val="28"/>
-        </w:rPr>
-        <w:t xml:space="preserve">     |   </w:t>
-      </w:r>
-      <w:r>
-        <w:rPr>
-          <w:b/>
-          <w:bCs/>
-          <w:sz w:val="28"/>
-          <w:szCs w:val="28"/>
-        </w:rPr>
-        <w:t xml:space="preserve">    </w:t>
-      </w:r>
-      <w:r>
-        <w:rPr>
-          <w:b/>
-          <w:bCs/>
-          <w:sz w:val="28"/>
-          <w:szCs w:val="28"/>
-        </w:rPr>
-        <w:t xml:space="preserve"> </w:t>
-      </w:r>
-      <w:r>
-        <w:rPr>
-          <w:b/>
-          <w:bCs/>
-          <w:sz w:val="28"/>
-          <w:szCs w:val="28"/>
-        </w:rPr>
-        <w:t xml:space="preserve">   </w:t>
-      </w:r>
-      <w:r>
-        <w:rPr>
-          <w:b/>
-          <w:bCs/>
-          <w:sz w:val="28"/>
-          <w:szCs w:val="28"/>
-        </w:rPr>
-        <w:t>\</w:t>
-      </w:r>
-    </w:p>
-    <w:p>
-      <w:pPr>
-        <w:jc w:val="both"/>
-        <w:rPr>
-          <w:sz w:val="32"/>
-          <w:szCs w:val="32"/>
-        </w:rPr>
-      </w:pPr>
-      <w:r>
-        <w:rPr>
-          <w:b/>
-          <w:bCs/>
-          <w:sz w:val="28"/>
-          <w:szCs w:val="28"/>
-        </w:rPr>
-        <w:t>All variables point here</w:t>
-      </w:r>
-      <w:r>
-        <w:rPr>
-          <w:b/>
-          <w:bCs/>
-          <w:sz w:val="28"/>
-          <w:szCs w:val="28"/>
-        </w:rPr>
-        <w:t xml:space="preserve"> (Entire App)</w:t>
-      </w:r>
-      <w:r>
-        <w:rPr>
-          <w:sz w:val="28"/>
-          <w:szCs w:val="28"/>
-        </w:rPr>
         <w:t>]</w:t>
       </w:r>
     </w:p>
@@ -11306,14 +11234,7 @@
           <w:sz w:val="32"/>
           <w:szCs w:val="32"/>
         </w:rPr>
-        <w:t># With Singleton, only one object exists</w:t>
-      </w:r>
-      <w:r>
-        <w:rPr>
-          <w:sz w:val="32"/>
-          <w:szCs w:val="32"/>
-        </w:rPr>
-        <w:t xml:space="preserve">. </w:t>
+        <w:t xml:space="preserve"># With Singleton, only one object exists. </w:t>
       </w:r>
       <w:r>
         <w:rPr>
@@ -11601,6 +11522,65 @@
         </w:rPr>
         <w:t>)</w:t>
       </w:r>
+      <w:r>
+        <w:rPr>
+          <w:sz w:val="32"/>
+          <w:szCs w:val="32"/>
+        </w:rPr>
+        <w:t>. Also takes the class internally as parameter like</w:t>
+      </w:r>
+      <w:r>
+        <w:rPr>
+          <w:b/>
+          <w:bCs/>
+          <w:sz w:val="32"/>
+          <w:szCs w:val="32"/>
+        </w:rPr>
+        <w:t xml:space="preserve"> self</w:t>
+      </w:r>
+      <w:r>
+        <w:rPr>
+          <w:b/>
+          <w:bCs/>
+          <w:sz w:val="32"/>
+          <w:szCs w:val="32"/>
+        </w:rPr>
+        <w:t xml:space="preserve"> </w:t>
+      </w:r>
+      <w:r>
+        <w:rPr>
+          <w:sz w:val="32"/>
+          <w:szCs w:val="32"/>
+        </w:rPr>
+        <w:t>(</w:t>
+      </w:r>
+      <w:proofErr w:type="spellStart"/>
+      <w:r>
+        <w:rPr>
+          <w:b/>
+          <w:bCs/>
+          <w:sz w:val="32"/>
+          <w:szCs w:val="32"/>
+        </w:rPr>
+        <w:t>classmethod</w:t>
+      </w:r>
+      <w:proofErr w:type="spellEnd"/>
+      <w:r>
+        <w:rPr>
+          <w:b/>
+          <w:bCs/>
+          <w:sz w:val="32"/>
+          <w:szCs w:val="32"/>
+        </w:rPr>
+        <w:t xml:space="preserve"> </w:t>
+      </w:r>
+      <w:r>
+        <w:rPr>
+          <w:sz w:val="32"/>
+          <w:szCs w:val="32"/>
+        </w:rPr>
+        <w:t>from above)</w:t>
+      </w:r>
     </w:p>
     <w:p>
       <w:pPr>
@@ -12023,42 +12003,31 @@
           <w:sz w:val="32"/>
           <w:szCs w:val="32"/>
         </w:rPr>
-        <w:t>db1 is db2)</w:t>
-      </w:r>
-      <w:r>
-        <w:rPr>
-          <w:b/>
-          <w:bCs/>
-          <w:color w:val="D86DCB" w:themeColor="accent5" w:themeTint="99"/>
-          <w:sz w:val="32"/>
-          <w:szCs w:val="32"/>
-        </w:rPr>
-        <w:t xml:space="preserve"> # True</w:t>
-      </w:r>
-    </w:p>
-    <w:p>
-      <w:pPr>
-        <w:jc w:val="both"/>
-        <w:rPr>
-          <w:sz w:val="32"/>
-          <w:szCs w:val="32"/>
-        </w:rPr>
-      </w:pPr>
-    </w:p>
-    <w:p>
-      <w:pPr>
-        <w:jc w:val="both"/>
-        <w:rPr>
-          <w:sz w:val="32"/>
-          <w:szCs w:val="32"/>
-        </w:rPr>
-      </w:pPr>
-      <w:r>
-        <w:rPr>
-          <w:sz w:val="32"/>
-          <w:szCs w:val="32"/>
-        </w:rPr>
-        <w:lastRenderedPageBreak/>
+        <w:t>db1 is db2) # True</w:t>
+      </w:r>
+    </w:p>
+    <w:p>
+      <w:pPr>
+        <w:jc w:val="both"/>
+        <w:rPr>
+          <w:sz w:val="32"/>
+          <w:szCs w:val="32"/>
+        </w:rPr>
+      </w:pPr>
+    </w:p>
+    <w:p>
+      <w:pPr>
+        <w:jc w:val="both"/>
+        <w:rPr>
+          <w:sz w:val="32"/>
+          <w:szCs w:val="32"/>
+        </w:rPr>
+      </w:pPr>
+      <w:r>
+        <w:rPr>
+          <w:sz w:val="32"/>
+          <w:szCs w:val="32"/>
+        </w:rPr>
         <w:t>Flutter Similarities:</w:t>
       </w:r>
     </w:p>
@@ -14332,6 +14301,7 @@
   <w:style w:type="character" w:default="1" w:styleId="DefaultParagraphFont">
     <w:name w:val="Default Paragraph Font"/>
     <w:uiPriority w:val="1"/>
+    <w:semiHidden/>
     <w:unhideWhenUsed/>
   </w:style>
   <w:style w:type="table" w:default="1" w:styleId="TableNormal">

</xml_diff>